<commit_message>
content: the data-minimisation checklist's record fields use the agreed labels (both editions, page and attachment)
</commit_message>
<xml_diff>
--- a/public/files/data-minimisation-checklist.docx
+++ b/public/files/data-minimisation-checklist.docx
@@ -407,7 +407,9 @@
             <w:shd w:val="clear" w:fill="E10707"/>
           </w:tcPr>
           <w:p>
-            <w:r/>
+            <w:r>
+              <w:t>由誰輸入</w:t>
+            </w:r>
             <w:r>
               <w:rPr>
                 <w:rFonts w:ascii="Quicksand" w:hAnsi="Quicksand" w:cs="Quicksand" w:eastAsia="Noto Sans TC"/>
@@ -415,7 +417,6 @@
                 <w:color w:val="FFFFFF"/>
                 <w:sz w:val="20"/>
               </w:rPr>
-              <w:t>日期</w:t>
             </w:r>
           </w:p>
         </w:tc>
@@ -425,7 +426,9 @@
             <w:shd w:val="clear" w:fill="E10707"/>
           </w:tcPr>
           <w:p>
-            <w:r/>
+            <w:r>
+              <w:t>何時</w:t>
+            </w:r>
             <w:r>
               <w:rPr>
                 <w:rFonts w:ascii="Quicksand" w:hAnsi="Quicksand" w:cs="Quicksand" w:eastAsia="Noto Sans TC"/>
@@ -433,7 +436,6 @@
                 <w:color w:val="FFFFFF"/>
                 <w:sz w:val="20"/>
               </w:rPr>
-              <w:t>輸入了甚麼（簡述）</w:t>
             </w:r>
           </w:p>
         </w:tc>
@@ -443,7 +445,9 @@
             <w:shd w:val="clear" w:fill="E10707"/>
           </w:tcPr>
           <w:p>
-            <w:r/>
+            <w:r>
+              <w:t>資料類別</w:t>
+            </w:r>
             <w:r>
               <w:rPr>
                 <w:rFonts w:ascii="Quicksand" w:hAnsi="Quicksand" w:cs="Quicksand" w:eastAsia="Noto Sans TC"/>
@@ -451,7 +455,6 @@
                 <w:color w:val="FFFFFF"/>
                 <w:sz w:val="20"/>
               </w:rPr>
-              <w:t>刪去了甚麼</w:t>
             </w:r>
           </w:p>
         </w:tc>
@@ -461,7 +464,9 @@
             <w:shd w:val="clear" w:fill="E10707"/>
           </w:tcPr>
           <w:p>
-            <w:r/>
+            <w:r>
+              <w:t>已匿名化</w:t>
+            </w:r>
             <w:r>
               <w:rPr>
                 <w:rFonts w:ascii="Quicksand" w:hAnsi="Quicksand" w:cs="Quicksand" w:eastAsia="Noto Sans TC"/>
@@ -469,7 +474,6 @@
                 <w:color w:val="FFFFFF"/>
                 <w:sz w:val="20"/>
               </w:rPr>
-              <w:t>由誰核對</w:t>
             </w:r>
           </w:p>
         </w:tc>

</xml_diff>